<commit_message>
feat: verify module samples before student alterations
</commit_message>
<xml_diff>
--- a/docs/modules/week14/Java_ILAW_Week_14.docx
+++ b/docs/modules/week14/Java_ILAW_Week_14.docx
@@ -11163,7 +11163,7 @@
     </w:p>
     <w:p>
       <w:r>
-        <w:t>Read the sample and predict its output. Then make the small change in Your task in the main code editor. Run code must finish successfully and match Expected task output. CodeShare marks the task Completed and unlocks the next step. Keep your supporting Vehicle classes and your saved changes. Personal performance-task work stays in its separate project. Paper liplets are assessed separately.</w:t>
+        <w:t>Click Work in code editor to load this step's sample and supporting classes. Run the unchanged sample first. Sample verified saves that check and opens editing for Your task; it does not complete the step. Make the small alteration, then Run code again. Matching Expected task output marks Completed, saves progress, and unlocks the next activity. New steps load their own sample; reopening a started step restores saved edits. Earlier work and personal performance-task submissions stay separate.</w:t>
       </w:r>
     </w:p>
     <w:p>
@@ -11262,9 +11262,9 @@
               <w:rPr>
                 <w:sz w:val="18"/>
               </w:rPr>
-              <w:t>Match Expected task output.</w:t>
+              <w:t>Verify sample first.</w:t>
               <w:br/>
-              <w:t>Completed opens the next task.</w:t>
+              <w:t>Then match task output.</w:t>
             </w:r>
           </w:p>
         </w:tc>
@@ -11307,9 +11307,9 @@
               <w:rPr>
                 <w:sz w:val="18"/>
               </w:rPr>
-              <w:t>Match Expected task output.</w:t>
+              <w:t>Verify sample first.</w:t>
               <w:br/>
-              <w:t>Completed opens the next task.</w:t>
+              <w:t>Then match task output.</w:t>
             </w:r>
           </w:p>
         </w:tc>
@@ -11352,9 +11352,9 @@
               <w:rPr>
                 <w:sz w:val="18"/>
               </w:rPr>
-              <w:t>Match Expected task output.</w:t>
+              <w:t>Verify sample first.</w:t>
               <w:br/>
-              <w:t>Completed opens the next task.</w:t>
+              <w:t>Then match task output.</w:t>
             </w:r>
           </w:p>
         </w:tc>
@@ -11397,9 +11397,9 @@
               <w:rPr>
                 <w:sz w:val="18"/>
               </w:rPr>
-              <w:t>Match Expected task output.</w:t>
+              <w:t>Verify sample first.</w:t>
               <w:br/>
-              <w:t>Completed opens the next task.</w:t>
+              <w:t>Then match task output.</w:t>
             </w:r>
           </w:p>
         </w:tc>
@@ -11442,9 +11442,9 @@
               <w:rPr>
                 <w:sz w:val="18"/>
               </w:rPr>
-              <w:t>Match Expected task output.</w:t>
+              <w:t>Verify sample first.</w:t>
               <w:br/>
-              <w:t>Completed opens the next task.</w:t>
+              <w:t>Then match task output.</w:t>
             </w:r>
           </w:p>
         </w:tc>
@@ -11487,9 +11487,9 @@
               <w:rPr>
                 <w:sz w:val="18"/>
               </w:rPr>
-              <w:t>Match Expected task output.</w:t>
+              <w:t>Verify sample first.</w:t>
               <w:br/>
-              <w:t>Completed opens the next task.</w:t>
+              <w:t>Then match task output.</w:t>
             </w:r>
           </w:p>
         </w:tc>
@@ -11532,9 +11532,9 @@
               <w:rPr>
                 <w:sz w:val="18"/>
               </w:rPr>
-              <w:t>Match Expected task output.</w:t>
+              <w:t>Verify sample first.</w:t>
               <w:br/>
-              <w:t>Completed opens the next task.</w:t>
+              <w:t>Then match task output.</w:t>
             </w:r>
           </w:p>
         </w:tc>
@@ -11577,9 +11577,9 @@
               <w:rPr>
                 <w:sz w:val="18"/>
               </w:rPr>
-              <w:t>Match Expected task output.</w:t>
+              <w:t>Verify sample first.</w:t>
               <w:br/>
-              <w:t>Completed opens the next task.</w:t>
+              <w:t>Then match task output.</w:t>
             </w:r>
           </w:p>
         </w:tc>
@@ -11622,9 +11622,9 @@
               <w:rPr>
                 <w:sz w:val="18"/>
               </w:rPr>
-              <w:t>Match Expected task output.</w:t>
+              <w:t>Verify sample first.</w:t>
               <w:br/>
-              <w:t>Completed opens the next task.</w:t>
+              <w:t>Then match task output.</w:t>
             </w:r>
           </w:p>
         </w:tc>
@@ -11667,9 +11667,9 @@
               <w:rPr>
                 <w:sz w:val="18"/>
               </w:rPr>
-              <w:t>Match Expected task output.</w:t>
+              <w:t>Verify sample first.</w:t>
               <w:br/>
-              <w:t>Completed opens the next task.</w:t>
+              <w:t>Then match task output.</w:t>
             </w:r>
           </w:p>
         </w:tc>
@@ -11712,9 +11712,9 @@
               <w:rPr>
                 <w:sz w:val="18"/>
               </w:rPr>
-              <w:t>Match Expected task output.</w:t>
+              <w:t>Verify sample first.</w:t>
               <w:br/>
-              <w:t>Completed opens the next task.</w:t>
+              <w:t>Then match task output.</w:t>
             </w:r>
           </w:p>
         </w:tc>
@@ -11722,7 +11722,12 @@
     </w:tbl>
     <w:p>
       <w:r>
-        <w:t>Teacher checks: an unchanged sample must not pass its alteration. Step 4 sorts only the displayed HashSet copy. Step 8 lists empty vehicles without removal; Step 9 teaches safe removal. Friday module practice remains separate from the own-theme performance task and presentation. Matching output is practice evidence, not a grade.</w:t>
+        <w:t>Teacher checks: sample verification alone must not complete its alteration. A large banner identifies sample verification, unchanged sample output, a mismatch, or Completed; a later failed run retains the earlier completion. Step 4 sorts only the displayed HashSet copy. Step 8 lists empty vehicles without removal; Step 9 teaches safe removal. Friday module practice remains separate from the own-theme performance task and presentation. Matching output is practice evidence, not a grade.</w:t>
+      </w:r>
+    </w:p>
+    <w:p>
+      <w:r>
+        <w:t>Sample check notes: Step 1 uses System.out.println("No vehicle there: index 5 is unavailable."); for a stable sample message. Step 8 intentionally throws java.util.ConcurrentModificationException and shows Expected error observed before the successful alteration. An error demonstration never completes a task. Existing completed tasks remain completed after the update.</w:t>
       </w:r>
     </w:p>
     <w:sectPr>
@@ -17040,6 +17045,7 @@
     </w:pPr>
     <w:rPr>
       <w:rFonts w:asciiTheme="majorHAnsi" w:eastAsiaTheme="majorEastAsia" w:hAnsiTheme="majorHAnsi" w:cstheme="majorBidi"/>
+      <w:color w:val="000000"/>
       <w:spacing w:val="-10"/>
       <w:kern w:val="28"/>
       <w:sz w:val="56"/>

</xml_diff>